<commit_message>
Make Reloader guide standalone
</commit_message>
<xml_diff>
--- a/docs/RELOADER-UBI9-MIGRATION-LEARNING-GUIDE.docx
+++ b/docs/RELOADER-UBI9-MIGRATION-LEARNING-GUIDE.docx
@@ -348,7 +348,7 @@
     </w:p>
     <w:p>
       <w:r>
-        <w:t>This guide explains how to evaluate and implement the Reloader UBI9 image migration using the same disciplined approach used for OCM:</w:t>
+        <w:t>This guide explains how to evaluate and implement the Reloader UBI9 image migration using a disciplined, evidence-based approach:</w:t>
       </w:r>
     </w:p>
     <w:p>
@@ -425,7 +425,7 @@
     </w:p>
     <w:p>
       <w:r>
-        <w:t>This is a learning guide. Do not copy OCM changes without checking how Reloader already works.</w:t>
+        <w:t>This is a learning guide. Understand how Reloader already works before making changes.</w:t>
       </w:r>
     </w:p>
     <w:p>
@@ -504,12 +504,12 @@
         <w:pStyle w:val="Heading1"/>
       </w:pPr>
       <w:r>
-        <w:t>3. Important difference from OCM</w:t>
-      </w:r>
-    </w:p>
-    <w:p>
-      <w:r>
-        <w:t>OCM contained five component images and two operator-driven Helm charts. Reloader is simpler:</w:t>
+        <w:t>3. Reloader project structure</w:t>
+      </w:r>
+    </w:p>
+    <w:p>
+      <w:r>
+        <w:t>Reloader has a focused controller architecture:</w:t>
       </w:r>
     </w:p>
     <w:p>
@@ -552,7 +552,7 @@
         <w:pStyle w:val="ListBullet"/>
       </w:pPr>
       <w:r>
-        <w:t>no ClusterManager/Klusterlet operator flow; and</w:t>
+        <w:t>no separate Kubernetes operator installation; and</w:t>
       </w:r>
     </w:p>
     <w:p>
@@ -1349,7 +1349,7 @@
     </w:p>
     <w:p>
       <w:r>
-        <w:t>Keep upstream logic whenever it already meets the requirement. Do not replace the existing UBI packaging design merely because OCM used a different layout.</w:t>
+        <w:t>Keep upstream logic whenever it already meets the requirement. Do not replace the existing UBI packaging design without an approved technical reason.</w:t>
       </w:r>
     </w:p>
     <w:p>
@@ -2593,7 +2593,7 @@
     </w:p>
     <w:p>
       <w:r>
-        <w:t>Unlike OCM, Reloader does not need a hub cluster, managed cluster, bootstrap kubeconfig, ClusterManager, or Klusterlet.</w:t>
+        <w:t>Reloader is installed directly into the target Kubernetes cluster as a controller Deployment. No separate multicluster bootstrap flow is required.</w:t>
       </w:r>
     </w:p>
     <w:p>
@@ -3359,7 +3359,7 @@
         <w:pStyle w:val="ListBullet"/>
       </w:pPr>
       <w:r>
-        <w:t>Treating Reloader like OCM with multiple operators and clusters.</w:t>
+        <w:t>Inventing unnecessary operators, images, or multicluster installation steps.</w:t>
       </w:r>
     </w:p>
     <w:p>

</xml_diff>